<commit_message>
Document the ECR credential expiry finding
</commit_message>
<xml_diff>
--- a/docs/04-operations-manual.docx
+++ b/docs/04-operations-manual.docx
@@ -2309,7 +2309,7 @@
     </w:p>
     <w:bookmarkEnd w:id="43"/>
     <w:bookmarkEnd w:id="44"/>
-    <w:bookmarkStart w:id="51" w:name="troubleshooting"/>
+    <w:bookmarkStart w:id="52" w:name="troubleshooting"/>
     <w:p>
       <w:pPr>
         <w:pStyle w:val="Heading1"/>
@@ -2604,13 +2604,140 @@
       </w:r>
     </w:p>
     <w:bookmarkEnd w:id="48"/>
-    <w:bookmarkStart w:id="49" w:name="terraform-state-is-locked"/>
+    <w:bookmarkStart w:id="49" w:name="a-pod-is-stuck-in-imagepullbackoff"/>
     <w:p>
       <w:pPr>
         <w:pStyle w:val="Heading2"/>
       </w:pPr>
       <w:r>
-        <w:t xml:space="preserve">7.5 Terraform state is locked</w:t>
+        <w:t xml:space="preserve">7.5 A pod is stuck in ImagePullBackOff</w:t>
+      </w:r>
+    </w:p>
+    <w:p>
+      <w:pPr>
+        <w:pStyle w:val="FirstParagraph"/>
+      </w:pPr>
+      <w:r>
+        <w:t xml:space="preserve">The ECR pull secret has expired. Registry authentication uses a password, and the ECR token behind that password lives twelve hours.</w:t>
+      </w:r>
+    </w:p>
+    <w:p>
+      <w:pPr>
+        <w:pStyle w:val="BodyText"/>
+      </w:pPr>
+      <w:r>
+        <w:t xml:space="preserve">Check the timer first:</w:t>
+      </w:r>
+    </w:p>
+    <w:p>
+      <w:pPr>
+        <w:pStyle w:val="SourceCode"/>
+      </w:pPr>
+      <w:r>
+        <w:rPr>
+          <w:rStyle w:val="VerbatimChar"/>
+        </w:rPr>
+        <w:t xml:space="preserve">systemctl list-timers ecr-secret.timer --no-pager</w:t>
+      </w:r>
+    </w:p>
+    <w:p>
+      <w:pPr>
+        <w:pStyle w:val="FirstParagraph"/>
+      </w:pPr>
+      <w:r>
+        <w:t xml:space="preserve">If it is not listed, the unit was never installed on this node. Run</w:t>
+      </w:r>
+      <w:r>
+        <w:t xml:space="preserve"> </w:t>
+      </w:r>
+      <w:r>
+        <w:rPr>
+          <w:rStyle w:val="VerbatimChar"/>
+        </w:rPr>
+        <w:t xml:space="preserve">soar/console/ecr/setup-ecr-auth.sh</w:t>
+      </w:r>
+      <w:r>
+        <w:t xml:space="preserve"> </w:t>
+      </w:r>
+      <w:r>
+        <w:t xml:space="preserve">on the node, which installs it.</w:t>
+      </w:r>
+    </w:p>
+    <w:p>
+      <w:pPr>
+        <w:pStyle w:val="BodyText"/>
+      </w:pPr>
+      <w:r>
+        <w:t xml:space="preserve">If it is listed but the last run failed:</w:t>
+      </w:r>
+    </w:p>
+    <w:p>
+      <w:pPr>
+        <w:pStyle w:val="SourceCode"/>
+      </w:pPr>
+      <w:r>
+        <w:rPr>
+          <w:rStyle w:val="VerbatimChar"/>
+        </w:rPr>
+        <w:t xml:space="preserve">sudo journalctl -u ecr-secret.service --no-pager | tail -20</w:t>
+      </w:r>
+    </w:p>
+    <w:p>
+      <w:pPr>
+        <w:pStyle w:val="FirstParagraph"/>
+      </w:pPr>
+      <w:r>
+        <w:t xml:space="preserve">Force a refresh and restart the deployment:</w:t>
+      </w:r>
+    </w:p>
+    <w:p>
+      <w:pPr>
+        <w:pStyle w:val="SourceCode"/>
+      </w:pPr>
+      <w:r>
+        <w:rPr>
+          <w:rStyle w:val="VerbatimChar"/>
+        </w:rPr>
+        <w:t xml:space="preserve">sudo systemctl start ecr-secret.service</w:t>
+      </w:r>
+      <w:r>
+        <w:br/>
+      </w:r>
+      <w:r>
+        <w:rPr>
+          <w:rStyle w:val="VerbatimChar"/>
+        </w:rPr>
+        <w:t xml:space="preserve">sudo kubectl -n soar rollout restart deployment/soar-console</w:t>
+      </w:r>
+    </w:p>
+    <w:p>
+      <w:pPr>
+        <w:pStyle w:val="FirstParagraph"/>
+      </w:pPr>
+      <w:r>
+        <w:t xml:space="preserve">Running pods are unaffected by an expired token, because their images are</w:t>
+      </w:r>
+      <w:r>
+        <w:t xml:space="preserve"> </w:t>
+      </w:r>
+      <w:r>
+        <w:t xml:space="preserve">already on disk. Only a pod that needs to pull fails, which is why this</w:t>
+      </w:r>
+      <w:r>
+        <w:t xml:space="preserve"> </w:t>
+      </w:r>
+      <w:r>
+        <w:t xml:space="preserve">surfaces during a rollout rather than at the moment of expiry.</w:t>
+      </w:r>
+    </w:p>
+    <w:bookmarkEnd w:id="49"/>
+    <w:bookmarkStart w:id="50" w:name="terraform-state-is-locked"/>
+    <w:p>
+      <w:pPr>
+        <w:pStyle w:val="Heading2"/>
+      </w:pPr>
+      <w:r>
+        <w:t xml:space="preserve">7.6 Terraform state is locked</w:t>
       </w:r>
     </w:p>
     <w:p>
@@ -2675,14 +2802,14 @@
         <w:t xml:space="preserve">terraform state list</w:t>
       </w:r>
     </w:p>
-    <w:bookmarkEnd w:id="49"/>
-    <w:bookmarkStart w:id="50" w:name="grafana-shows-no-soar-metrics"/>
+    <w:bookmarkEnd w:id="50"/>
+    <w:bookmarkStart w:id="51" w:name="grafana-shows-no-soar-metrics"/>
     <w:p>
       <w:pPr>
         <w:pStyle w:val="Heading2"/>
       </w:pPr>
       <w:r>
-        <w:t xml:space="preserve">7.6 Grafana shows no SOAR metrics</w:t>
+        <w:t xml:space="preserve">7.7 Grafana shows no SOAR metrics</w:t>
       </w:r>
     </w:p>
     <w:p>
@@ -2720,9 +2847,9 @@
         <w:t xml:space="preserve">Note that metrics only exist after the functions have run. On a quiet system the panels are legitimately empty. Run a test to generate data.</w:t>
       </w:r>
     </w:p>
-    <w:bookmarkEnd w:id="50"/>
     <w:bookmarkEnd w:id="51"/>
-    <w:bookmarkStart w:id="52" w:name="emergency-stop"/>
+    <w:bookmarkEnd w:id="52"/>
+    <w:bookmarkStart w:id="53" w:name="emergency-stop"/>
     <w:p>
       <w:pPr>
         <w:pStyle w:val="Heading1"/>
@@ -2809,8 +2936,8 @@
         <w:t xml:space="preserve">  --event-bus-name innovatech-soar --region eu-central-1</w:t>
       </w:r>
     </w:p>
-    <w:bookmarkEnd w:id="52"/>
-    <w:bookmarkStart w:id="55" w:name="recovery"/>
+    <w:bookmarkEnd w:id="53"/>
+    <w:bookmarkStart w:id="56" w:name="recovery"/>
     <w:p>
       <w:pPr>
         <w:pStyle w:val="Heading1"/>
@@ -2819,7 +2946,7 @@
         <w:t xml:space="preserve">9. Recovery</w:t>
       </w:r>
     </w:p>
-    <w:bookmarkStart w:id="53" w:name="rebuilding-from-nothing"/>
+    <w:bookmarkStart w:id="54" w:name="rebuilding-from-nothing"/>
     <w:p>
       <w:pPr>
         <w:pStyle w:val="Heading2"/>
@@ -2928,8 +3055,8 @@
         <w:t xml:space="preserve">Around thirty minutes end to end, most of it Transit Gateway attachments and the k3s bootstrap.</w:t>
       </w:r>
     </w:p>
-    <w:bookmarkEnd w:id="53"/>
-    <w:bookmarkStart w:id="54" w:name="what-is-not-backed-up"/>
+    <w:bookmarkEnd w:id="54"/>
+    <w:bookmarkStart w:id="55" w:name="what-is-not-backed-up"/>
     <w:p>
       <w:pPr>
         <w:pStyle w:val="Heading2"/>
@@ -3127,9 +3254,9 @@
         <w:t xml:space="preserve">That last row is a real gap rather than an oversight to hide. The fix is to commit dashboard JSON into the repository so it is recreated on deployment.</w:t>
       </w:r>
     </w:p>
-    <w:bookmarkEnd w:id="54"/>
     <w:bookmarkEnd w:id="55"/>
-    <w:bookmarkStart w:id="56" w:name="cost-control"/>
+    <w:bookmarkEnd w:id="56"/>
+    <w:bookmarkStart w:id="57" w:name="cost-control"/>
     <w:p>
       <w:pPr>
         <w:pStyle w:val="Heading1"/>
@@ -3205,7 +3332,7 @@
         <w:t xml:space="preserve">Do not destroy and recreate the Transit Gateway to save money. Attachment creation and deletion each take several minutes, and the saving is small relative to the disruption.</w:t>
       </w:r>
     </w:p>
-    <w:bookmarkEnd w:id="56"/>
+    <w:bookmarkEnd w:id="57"/>
     <w:sectPr/>
   </w:body>
 </w:document>

</xml_diff>

<commit_message>
Record R-06 results and the Tailscale hostname finding
</commit_message>
<xml_diff>
--- a/docs/04-operations-manual.docx
+++ b/docs/04-operations-manual.docx
@@ -1660,7 +1660,7 @@
         <w:pStyle w:val="FirstParagraph"/>
       </w:pPr>
       <w:r>
-        <w:t xml:space="preserve">Around four minutes to Ready. Then run the Observability workflow to restore the monitoring stack:</w:t>
+        <w:t xml:space="preserve">Around four minutes to Ready. The bootstrap installs the ECR credential timer itself, so the node can pull container images without any manual setup. Then run the Observability workflow to restore the monitoring stack:</w:t>
       </w:r>
     </w:p>
     <w:p>
@@ -3045,6 +3045,39 @@
       </w:pPr>
       <w:r>
         <w:t xml:space="preserve">Two things do not come back automatically. The SNS email subscription needs confirming from the inbox, and Tailscale subnet routes need approving in the Tailscale admin console. Both are manual by design, because both are consent steps.</w:t>
+      </w:r>
+    </w:p>
+    <w:p>
+      <w:pPr>
+        <w:pStyle w:val="BodyText"/>
+      </w:pPr>
+      <w:r>
+        <w:rPr>
+          <w:bCs/>
+          <w:b/>
+        </w:rPr>
+        <w:t xml:space="preserve">Approve the routes on the right machine.</w:t>
+      </w:r>
+      <w:r>
+        <w:t xml:space="preserve"> </w:t>
+      </w:r>
+      <w:r>
+        <w:t xml:space="preserve">A replaced instance registers as a new tailnet node with a suffixed hostname,</w:t>
+      </w:r>
+      <w:r>
+        <w:t xml:space="preserve"> </w:t>
+      </w:r>
+      <w:r>
+        <w:rPr>
+          <w:rStyle w:val="VerbatimChar"/>
+        </w:rPr>
+        <w:t xml:space="preserve">innovatech-aws-gw-1</w:t>
+      </w:r>
+      <w:r>
+        <w:t xml:space="preserve"> </w:t>
+      </w:r>
+      <w:r>
+        <w:t xml:space="preserve">and so on, while the old entry remains listed and shows as disconnected. Approving routes on the stale entry appears to succeed and has no effect, because that machine no longer exists. Check the connection status column, approve on the connected one, and delete the old entry so the list does not accumulate ghosts.</w:t>
       </w:r>
     </w:p>
     <w:p>

</xml_diff>